<commit_message>
feat: mostra resumo e contrato completo ao locatário antes de assinar
- Link público exibe resumo em linguagem simples e o texto integral do
  contrato, com os dados do locatário espelhados enquanto ele digita;
  o aceite só é liberado após rolar o contrato até o fim.
- Revisa o modelo .docx: remove termos de hospedagem/check-in, corrige
  LOCADOR/LOCATÁRIO na cláusula 8ª, referência à cláusula de assinatura,
  e passa a citar a assinatura eletrônica da própria plataforma.
- Foro e data de assinatura agora são preenchidos (cidade do imóvel e
  data de geração); valor sempre sai com "R$" uma única vez.

Co-Authored-By: Claude Opus 5.5 <noreply@anthropic.com>
</commit_message>
<xml_diff>
--- a/contratos/Contrato_de_Locacao_Residencial.docx
+++ b/contratos/Contrato_de_Locacao_Residencial.docx
@@ -823,33 +823,32 @@
           <w:sz w:val="22"/>
           <w:szCs w:val="22"/>
         </w:rPr>
-        <w:t>CLÁUSULA 4ª – DO VALOR D</w:t>
-      </w:r>
-      <w:r>
-        <w:rPr>
-          <w:rFonts w:eastAsia="Arial" w:cs="Arial" w:ascii="Arial" w:hAnsi="Arial"/>
-          <w:b/>
-          <w:bCs/>
-          <w:sz w:val="22"/>
-          <w:szCs w:val="22"/>
-        </w:rPr>
-        <w:t>A ALOCAÇÃO</w:t>
-      </w:r>
-    </w:p>
-    <w:p>
-      <w:pPr>
-        <w:pStyle w:val="Normal"/>
-        <w:spacing w:lineRule="auto" w:line="300" w:before="0" w:after="120"/>
-        <w:jc w:val="both"/>
-        <w:rPr/>
-      </w:pPr>
-      <w:r>
-        <w:rPr>
-          <w:rFonts w:eastAsia="Arial" w:cs="Arial" w:ascii="Arial" w:hAnsi="Arial"/>
-          <w:sz w:val="22"/>
-          <w:szCs w:val="22"/>
-        </w:rPr>
-        <w:t>O valor da locação será de R$ {{valor}}, sendo 50% (cinquenta por cento) pagos no ato da reserva e os 50% restantes no dia do check-in."</w:t>
+        <w:t>CLÁUSULA 4ª – DO VALOR DA LOCAÇÃO</w:t>
+      </w:r>
+      <w:r>
+        <w:rPr>
+          <w:rFonts w:eastAsia="Arial" w:cs="Arial" w:ascii="Arial" w:hAnsi="Arial"/>
+          <w:b/>
+          <w:bCs/>
+          <w:sz w:val="22"/>
+          <w:szCs w:val="22"/>
+        </w:rPr>
+      </w:r>
+    </w:p>
+    <w:p>
+      <w:pPr>
+        <w:pStyle w:val="Normal"/>
+        <w:spacing w:lineRule="auto" w:line="300" w:before="0" w:after="120"/>
+        <w:jc w:val="both"/>
+        <w:rPr/>
+      </w:pPr>
+      <w:r>
+        <w:rPr>
+          <w:rFonts w:eastAsia="Arial" w:cs="Arial" w:ascii="Arial" w:hAnsi="Arial"/>
+          <w:sz w:val="22"/>
+          <w:szCs w:val="22"/>
+        </w:rPr>
+        <w:t>O valor da locação será de {{valor}}.</w:t>
       </w:r>
     </w:p>
     <w:p>
@@ -1106,7 +1105,7 @@
           <w:sz w:val="22"/>
           <w:szCs w:val="22"/>
         </w:rPr>
-        <w:t>I – Efetuar o pagamento do valor da hospedagem e eventuais taxas nos prazos e condições pactuados neste contrato;</w:t>
+        <w:t>I – Efetuar o pagamento do aluguel e eventuais encargos nos prazos e condições pactuados neste contrato;</w:t>
       </w:r>
     </w:p>
     <w:p>
@@ -1126,7 +1125,7 @@
           <w:sz w:val="22"/>
           <w:szCs w:val="22"/>
         </w:rPr>
-        <w:t>II – Utilizar o imóvel exclusivamente para fins de hospedagem temporária, respeitando a capacidade máxima de ocupantes permitida;</w:t>
+        <w:t>II – Utilizar o imóvel exclusivamente para fins residenciais, respeitando a capacidade máxima de ocupantes permitida;</w:t>
       </w:r>
     </w:p>
     <w:p>
@@ -1166,23 +1165,21 @@
           <w:sz w:val="22"/>
           <w:szCs w:val="22"/>
         </w:rPr>
-        <w:t xml:space="preserve">IV – Comunicar imediatamente ao </w:t>
-      </w:r>
-      <w:r>
-        <w:rPr>
-          <w:rFonts w:eastAsia="Arial" w:cs="Arial" w:ascii="Arial" w:hAnsi="Arial"/>
-          <w:sz w:val="22"/>
-          <w:szCs w:val="22"/>
-        </w:rPr>
-        <w:t>LOCADOR</w:t>
-      </w:r>
-      <w:r>
-        <w:rPr>
-          <w:rFonts w:eastAsia="Arial" w:cs="Arial" w:ascii="Arial" w:hAnsi="Arial"/>
-          <w:sz w:val="22"/>
-          <w:szCs w:val="22"/>
-        </w:rPr>
-        <w:t xml:space="preserve"> qualquer dano, defeito ou avaria ocorrido durante a estadia;</w:t>
+        <w:t>IV – Comunicar imediatamente ao LOCADOR qualquer dano, defeito ou avaria ocorrido no imóvel durante a locação;</w:t>
+      </w:r>
+      <w:r>
+        <w:rPr>
+          <w:rFonts w:eastAsia="Arial" w:cs="Arial" w:ascii="Arial" w:hAnsi="Arial"/>
+          <w:sz w:val="22"/>
+          <w:szCs w:val="22"/>
+        </w:rPr>
+      </w:r>
+      <w:r>
+        <w:rPr>
+          <w:rFonts w:eastAsia="Arial" w:cs="Arial" w:ascii="Arial" w:hAnsi="Arial"/>
+          <w:sz w:val="22"/>
+          <w:szCs w:val="22"/>
+        </w:rPr>
       </w:r>
     </w:p>
     <w:p>
@@ -1333,25 +1330,23 @@
           <w:sz w:val="22"/>
           <w:szCs w:val="22"/>
         </w:rPr>
-        <w:t xml:space="preserve">I – Entregar o imóvel ao </w:t>
-      </w:r>
-      <w:r>
-        <w:rPr>
-          <w:rFonts w:eastAsia="Arial" w:cs="Arial" w:ascii="Arial" w:hAnsi="Arial"/>
-          <w:b w:val="false"/>
-          <w:bCs w:val="false"/>
-          <w:sz w:val="22"/>
-          <w:szCs w:val="22"/>
-        </w:rPr>
-        <w:t>LOCADOR</w:t>
-      </w:r>
-      <w:r>
-        <w:rPr>
-          <w:rFonts w:eastAsia="Arial" w:cs="Arial" w:ascii="Arial" w:hAnsi="Arial"/>
-          <w:sz w:val="22"/>
-          <w:szCs w:val="22"/>
-        </w:rPr>
-        <w:t xml:space="preserve"> limpo, higienizado e em perfeitas condições de uso na data e horário de check-in combinados;</w:t>
+        <w:t>I – Entregar o imóvel ao LOCATÁRIO limpo, higienizado e em perfeitas condições de uso na data de início da locação;</w:t>
+      </w:r>
+      <w:r>
+        <w:rPr>
+          <w:rFonts w:eastAsia="Arial" w:cs="Arial" w:ascii="Arial" w:hAnsi="Arial"/>
+          <w:b w:val="false"/>
+          <w:bCs w:val="false"/>
+          <w:sz w:val="22"/>
+          <w:szCs w:val="22"/>
+        </w:rPr>
+      </w:r>
+      <w:r>
+        <w:rPr>
+          <w:rFonts w:eastAsia="Arial" w:cs="Arial" w:ascii="Arial" w:hAnsi="Arial"/>
+          <w:sz w:val="22"/>
+          <w:szCs w:val="22"/>
+        </w:rPr>
       </w:r>
     </w:p>
     <w:p>
@@ -1371,25 +1366,23 @@
           <w:sz w:val="22"/>
           <w:szCs w:val="22"/>
         </w:rPr>
-        <w:t xml:space="preserve">II – Garantir ao </w:t>
-      </w:r>
-      <w:r>
-        <w:rPr>
-          <w:rFonts w:eastAsia="Arial" w:cs="Arial" w:ascii="Arial" w:hAnsi="Arial"/>
-          <w:b w:val="false"/>
-          <w:bCs w:val="false"/>
-          <w:sz w:val="22"/>
-          <w:szCs w:val="22"/>
-        </w:rPr>
-        <w:t>LOCADOR</w:t>
-      </w:r>
-      <w:r>
-        <w:rPr>
-          <w:rFonts w:eastAsia="Arial" w:cs="Arial" w:ascii="Arial" w:hAnsi="Arial"/>
-          <w:sz w:val="22"/>
-          <w:szCs w:val="22"/>
-        </w:rPr>
-        <w:t xml:space="preserve"> o uso tranquilo, privativo e pacífico do imóvel durante todo o período da hospedagem;</w:t>
+        <w:t>II – Garantir ao LOCATÁRIO o uso tranquilo, privativo e pacífico do imóvel durante todo o período da locação;</w:t>
+      </w:r>
+      <w:r>
+        <w:rPr>
+          <w:rFonts w:eastAsia="Arial" w:cs="Arial" w:ascii="Arial" w:hAnsi="Arial"/>
+          <w:b w:val="false"/>
+          <w:bCs w:val="false"/>
+          <w:sz w:val="22"/>
+          <w:szCs w:val="22"/>
+        </w:rPr>
+      </w:r>
+      <w:r>
+        <w:rPr>
+          <w:rFonts w:eastAsia="Arial" w:cs="Arial" w:ascii="Arial" w:hAnsi="Arial"/>
+          <w:sz w:val="22"/>
+          <w:szCs w:val="22"/>
+        </w:rPr>
       </w:r>
     </w:p>
     <w:p>
@@ -1429,25 +1422,23 @@
           <w:sz w:val="22"/>
           <w:szCs w:val="22"/>
         </w:rPr>
-        <w:t xml:space="preserve">IV – Prestar o suporte necessário e fornecer as instruções claras de acesso, check-in e check-out ao </w:t>
-      </w:r>
-      <w:r>
-        <w:rPr>
-          <w:rFonts w:eastAsia="Arial" w:cs="Arial" w:ascii="Arial" w:hAnsi="Arial"/>
-          <w:b w:val="false"/>
-          <w:bCs w:val="false"/>
-          <w:sz w:val="22"/>
-          <w:szCs w:val="22"/>
-        </w:rPr>
-        <w:t>LOCADOR</w:t>
-      </w:r>
-      <w:r>
-        <w:rPr>
-          <w:rFonts w:eastAsia="Arial" w:cs="Arial" w:ascii="Arial" w:hAnsi="Arial"/>
-          <w:sz w:val="22"/>
-          <w:szCs w:val="22"/>
-        </w:rPr>
-        <w:t>.</w:t>
+        <w:t>IV – Prestar o suporte necessário e fornecer ao LOCATÁRIO as instruções de acesso ao imóvel.</w:t>
+      </w:r>
+      <w:r>
+        <w:rPr>
+          <w:rFonts w:eastAsia="Arial" w:cs="Arial" w:ascii="Arial" w:hAnsi="Arial"/>
+          <w:b w:val="false"/>
+          <w:bCs w:val="false"/>
+          <w:sz w:val="22"/>
+          <w:szCs w:val="22"/>
+        </w:rPr>
+      </w:r>
+      <w:r>
+        <w:rPr>
+          <w:rFonts w:eastAsia="Arial" w:cs="Arial" w:ascii="Arial" w:hAnsi="Arial"/>
+          <w:sz w:val="22"/>
+          <w:szCs w:val="22"/>
+        </w:rPr>
       </w:r>
     </w:p>
     <w:p>
@@ -1576,23 +1567,21 @@
           <w:sz w:val="22"/>
           <w:szCs w:val="22"/>
         </w:rPr>
-        <w:t xml:space="preserve">Ao término da estadia, o </w:t>
-      </w:r>
-      <w:r>
-        <w:rPr>
-          <w:rFonts w:eastAsia="Arial" w:cs="Arial" w:ascii="Arial" w:hAnsi="Arial"/>
-          <w:sz w:val="22"/>
-          <w:szCs w:val="22"/>
-        </w:rPr>
-        <w:t>locatário</w:t>
-      </w:r>
-      <w:r>
-        <w:rPr>
-          <w:rFonts w:eastAsia="Arial" w:cs="Arial" w:ascii="Arial" w:hAnsi="Arial"/>
-          <w:sz w:val="22"/>
-          <w:szCs w:val="22"/>
-        </w:rPr>
-        <w:t xml:space="preserve"> deverá entregar o imóvel desocupado no horário de check-out combinado, com os bens organizados nas mesmas condições encontradas na entrada, ressalvado o desgaste natural do uso regular.</w:t>
+        <w:t>Ao término da locação, o LOCATÁRIO deverá entregar o imóvel desocupado na data de término do contrato, nas mesmas condições em que o recebeu, ressalvado o desgaste natural do uso regular.</w:t>
+      </w:r>
+      <w:r>
+        <w:rPr>
+          <w:rFonts w:eastAsia="Arial" w:cs="Arial" w:ascii="Arial" w:hAnsi="Arial"/>
+          <w:sz w:val="22"/>
+          <w:szCs w:val="22"/>
+        </w:rPr>
+      </w:r>
+      <w:r>
+        <w:rPr>
+          <w:rFonts w:eastAsia="Arial" w:cs="Arial" w:ascii="Arial" w:hAnsi="Arial"/>
+          <w:sz w:val="22"/>
+          <w:szCs w:val="22"/>
+        </w:rPr>
       </w:r>
     </w:p>
     <w:p>
@@ -1865,23 +1854,23 @@
           <w:sz w:val="22"/>
           <w:szCs w:val="22"/>
         </w:rPr>
-        <w:t>As partes e as testemunhas reconhecem e aceitam, para todos os fins de direito, a assinatura eletrônica realizada por meio da plataforma oficial do Governo Federal (gov.br), a qual terá a mesma validade e eficácia jurídica da assinatura manuscrita, nos termos da Medida Provisória nº 2.200-2/2001 (art. 10, § 2º), da Lei nº 14.063/2020 e do art. 784, § 4º, do Código de Processo Civil.</w:t>
-      </w:r>
-    </w:p>
-    <w:p>
-      <w:pPr>
-        <w:pStyle w:val="Normal"/>
-        <w:spacing w:lineRule="auto" w:line="300" w:before="0" w:after="120"/>
-        <w:jc w:val="both"/>
-        <w:rPr/>
-      </w:pPr>
-      <w:r>
-        <w:rPr>
-          <w:rFonts w:eastAsia="Arial" w:cs="Arial" w:ascii="Arial" w:hAnsi="Arial"/>
-          <w:sz w:val="22"/>
-          <w:szCs w:val="22"/>
-        </w:rPr>
-        <w:t>Parágrafo primeiro. O presente contrato poderá ser assinado de forma manuscrita, eletrônica ou híbrida, sendo válida a combinação de assinaturas manuscritas e eletrônicas entre as partes e testemunhas.</w:t>
+        <w:t>As partes reconhecem e aceitam, para todos os fins de direito, a assinatura eletrônica realizada por meio da plataforma Imofácil, que registra nome, documento, endereço IP, data e hora de cada assinatura e o código de integridade (hash SHA-256) do documento assinado, a qual terá a mesma validade e eficácia jurídica da assinatura manuscrita, nos termos da Medida Provisória nº 2.200-2/2001 (art. 10, § 2º), da Lei nº 14.063/2020 e do art. 784, § 4º, do Código de Processo Civil.</w:t>
+      </w:r>
+    </w:p>
+    <w:p>
+      <w:pPr>
+        <w:pStyle w:val="Normal"/>
+        <w:spacing w:lineRule="auto" w:line="300" w:before="0" w:after="120"/>
+        <w:jc w:val="both"/>
+        <w:rPr/>
+      </w:pPr>
+      <w:r>
+        <w:rPr>
+          <w:rFonts w:eastAsia="Arial" w:cs="Arial" w:ascii="Arial" w:hAnsi="Arial"/>
+          <w:sz w:val="22"/>
+          <w:szCs w:val="22"/>
+        </w:rPr>
+        <w:t>Parágrafo primeiro. O presente contrato poderá ser assinado de forma manuscrita, eletrônica ou híbrida, sendo válida a combinação de assinaturas manuscritas e eletrônicas entre as partes.</w:t>
       </w:r>
     </w:p>
     <w:p>
@@ -1947,7 +1936,7 @@
         <w:rPr/>
       </w:pPr>
       <w:r>
-        <w:t>Fica eleito o foro da comarca de {{cidade_locador}}/{{uf_locador}}, para dirimir eventuais questões decorrentes deste contrato, ressalvadas as disposições legais de competência aplicáveis ao caso.</w:t>
+        <w:t>Fica eleito o foro da comarca de {{cidade_imovel}}/{{estado_imovel}}, local do imóvel, para dirimir eventuais questões decorrentes deste contrato, ressalvadas as disposições legais de competência aplicáveis ao caso.</w:t>
       </w:r>
     </w:p>
     <w:p>
@@ -1964,7 +1953,7 @@
           <w:sz w:val="22"/>
           <w:szCs w:val="22"/>
         </w:rPr>
-        <w:t>E, por estarem de acordo, as partes assinam o presente instrumento em [02] vias de igual teor e forma, ou eletronicamente na forma da Cláusula 17ª, juntamente com as testemunhas abaixo.</w:t>
+        <w:t>E, por estarem de acordo, as partes assinam o presente instrumento em 02 (duas) vias de igual teor e forma, ou eletronicamente na forma da Cláusula 13ª.</w:t>
       </w:r>
     </w:p>
     <w:p>
@@ -1976,7 +1965,7 @@
         <w:rPr/>
       </w:pPr>
       <w:r>
-        <w:t>{{cidade_locador}}, {{dia_assinatura}} de {{mes}} de {{ano}}</w:t>
+        <w:t>{{cidade_imovel}}, {{dia_assinatura}} de {{mes}} de {{ano}}</w:t>
       </w:r>
     </w:p>
     <w:p>

</xml_diff>